<commit_message>
fix(e2e): corrige fluxo de pagamento de fatura e atualiza massa do CT03.1
- selecionarOpcaoPagamento: retry com dismissal de popup entre tentativas
  (clique force:true perdia a corrida contra popups automaticos como Saude
  Financeira/Aviso de Atraso, que abriam sobre o botao "Pagar Fatura")
- digitarPin: faltava clicar em "Confirmar" apos preencher o PIN, entao o
  pagamento nunca era de fato enviado; removido o atalho "Auto" (mock
  hardcoded para "3719", divergente do PIN real das cartas semeadas)
- pagamentoFatura.spec.ts: captura o novo modal de comprovante de pagamento
  e valida o lancamento real na aba Aberta, nao so a troca de aba
- massa do CT03.1 atualizada para CPF com fatura fechada em aberto e saldo
  suficiente para pagamento total

Co-Authored-By: Claude Sonnet 5 <noreply@anthropic.com>
</commit_message>
<xml_diff>
--- a/data/Evidencia Modelo WEB.docx
+++ b/data/Evidencia Modelo WEB.docx
@@ -15,8 +15,8 @@
       <w:tblGrid>
         <w:gridCol w:w="1620"/>
         <w:gridCol w:w="290"/>
-        <w:gridCol w:w="6454"/>
-        <w:gridCol w:w="283"/>
+        <w:gridCol w:w="5178"/>
+        <w:gridCol w:w="1559"/>
         <w:gridCol w:w="1209"/>
         <w:gridCol w:w="208"/>
         <w:gridCol w:w="142"/>
@@ -131,7 +131,7 @@
         </w:tc>
         <w:tc>
           <w:tcPr>
-            <w:tcW w:w="6744" w:type="dxa"/>
+            <w:tcW w:w="5468" w:type="dxa"/>
             <w:gridSpan w:val="2"/>
             <w:tcBorders>
               <w:top w:val="single" w:sz="4" w:space="0" w:color="000000"/>
@@ -163,7 +163,7 @@
         </w:tc>
         <w:tc>
           <w:tcPr>
-            <w:tcW w:w="1492" w:type="dxa"/>
+            <w:tcW w:w="2768" w:type="dxa"/>
             <w:gridSpan w:val="2"/>
             <w:tcBorders>
               <w:top w:val="single" w:sz="4" w:space="0" w:color="auto"/>
@@ -465,7 +465,7 @@
         </w:tc>
         <w:tc>
           <w:tcPr>
-            <w:tcW w:w="6454" w:type="dxa"/>
+            <w:tcW w:w="5178" w:type="dxa"/>
             <w:tcBorders>
               <w:bottom w:val="single" w:sz="4" w:space="0" w:color="auto"/>
             </w:tcBorders>
@@ -489,7 +489,7 @@
         </w:tc>
         <w:tc>
           <w:tcPr>
-            <w:tcW w:w="1842" w:type="dxa"/>
+            <w:tcW w:w="3118" w:type="dxa"/>
             <w:gridSpan w:val="4"/>
           </w:tcPr>
           <w:p>
@@ -509,68 +509,13 @@
               <w:t xml:space="preserve">Status: </w:t>
             </w:r>
             <w:r>
-              <w:t>{{#isPassed}}</w:t>
-            </w:r>
-            <w:r>
-              <w:rPr>
-                <w:rFonts w:ascii="Arial" w:hAnsi="Arial" w:cs="Arial"/>
+              <w:rPr>
+                <w:rFonts w:ascii="Arial" w:hAnsi="Arial" w:cs="Arial"/>
+                <w:b/>
                 <w:i/>
                 <w:iCs/>
-                <w:b/>
-                <w:color w:val="008000"/>
               </w:rPr>
               <w:t>{{status}}</w:t>
-            </w:r>
-            <w:r>
-              <w:t>{{/isPassed}}</w:t>
-            </w:r>
-            <w:r>
-              <w:t>{{#isFailed}}</w:t>
-            </w:r>
-            <w:r>
-              <w:rPr>
-                <w:rFonts w:ascii="Arial" w:hAnsi="Arial" w:cs="Arial"/>
-                <w:i/>
-                <w:iCs/>
-                <w:b/>
-                <w:color w:val="C00000"/>
-              </w:rPr>
-              <w:t>{{status}}</w:t>
-            </w:r>
-            <w:r>
-              <w:t>{{/isFailed}}</w:t>
-            </w:r>
-            <w:r>
-              <w:t>{{#isNA}}</w:t>
-            </w:r>
-            <w:r>
-              <w:rPr>
-                <w:rFonts w:ascii="Arial" w:hAnsi="Arial" w:cs="Arial"/>
-                <w:i/>
-                <w:iCs/>
-                <w:b/>
-                <w:color w:val="808080"/>
-              </w:rPr>
-              <w:t>{{status}}</w:t>
-            </w:r>
-            <w:r>
-              <w:t>{{/isNA}}</w:t>
-            </w:r>
-            <w:r>
-              <w:t>{{#isOther}}</w:t>
-            </w:r>
-            <w:r>
-              <w:rPr>
-                <w:rFonts w:ascii="Arial" w:hAnsi="Arial" w:cs="Arial"/>
-                <w:i/>
-                <w:iCs/>
-                <w:b/>
-                <w:color w:val="ED7D31"/>
-              </w:rPr>
-              <w:t>{{status}}</w:t>
-            </w:r>
-            <w:r>
-              <w:t>{{/isOther}}</w:t>
             </w:r>
           </w:p>
         </w:tc>
@@ -612,36 +557,18 @@
                 <w:b/>
               </w:rPr>
             </w:pPr>
-            <w:proofErr w:type="spellStart"/>
             <w:r>
               <w:rPr>
                 <w:rFonts w:ascii="Arial" w:hAnsi="Arial" w:cs="Arial"/>
                 <w:b/>
               </w:rPr>
-              <w:t>Request</w:t>
-            </w:r>
-            <w:proofErr w:type="spellEnd"/>
-            <w:r>
-              <w:rPr>
-                <w:rFonts w:ascii="Arial" w:hAnsi="Arial" w:cs="Arial"/>
-                <w:b/>
-              </w:rPr>
-              <w:t xml:space="preserve"> </w:t>
-            </w:r>
-            <w:proofErr w:type="spellStart"/>
-            <w:r>
-              <w:rPr>
-                <w:rFonts w:ascii="Arial" w:hAnsi="Arial" w:cs="Arial"/>
-                <w:b/>
-              </w:rPr>
-              <w:t>method</w:t>
-            </w:r>
-            <w:proofErr w:type="spellEnd"/>
-          </w:p>
-        </w:tc>
-        <w:tc>
-          <w:tcPr>
-            <w:tcW w:w="6454" w:type="dxa"/>
+              <w:t>Navegador</w:t>
+            </w:r>
+          </w:p>
+        </w:tc>
+        <w:tc>
+          <w:tcPr>
+            <w:tcW w:w="5178" w:type="dxa"/>
             <w:tcBorders>
               <w:top w:val="single" w:sz="4" w:space="0" w:color="auto"/>
               <w:left w:val="single" w:sz="4" w:space="0" w:color="auto"/>
@@ -662,13 +589,13 @@
                 <w:rFonts w:ascii="Arial" w:hAnsi="Arial" w:cs="Arial"/>
                 <w:iCs/>
               </w:rPr>
-              <w:t>{{requestMethod}}</w:t>
-            </w:r>
-          </w:p>
-        </w:tc>
-        <w:tc>
-          <w:tcPr>
-            <w:tcW w:w="1842" w:type="dxa"/>
+              <w:t>{{navegador}}</w:t>
+            </w:r>
+          </w:p>
+        </w:tc>
+        <w:tc>
+          <w:tcPr>
+            <w:tcW w:w="3118" w:type="dxa"/>
             <w:gridSpan w:val="4"/>
             <w:tcBorders>
               <w:left w:val="nil"/>
@@ -1933,15 +1860,7 @@
               <w:b/>
               <w:sz w:val="24"/>
             </w:rPr>
-            <w:t xml:space="preserve">REGISTRO DE HOMOLOGAÇÃO – </w:t>
-          </w:r>
-          <w:r>
-            <w:rPr>
-              <w:rFonts w:ascii="Arial" w:hAnsi="Arial"/>
-              <w:b/>
-              <w:sz w:val="24"/>
-            </w:rPr>
-            <w:t>XXXXXXXX</w:t>
+            <w:t>REGISTRO DE HOMOLOGAÇÃO – XXXXXXXX</w:t>
           </w:r>
         </w:p>
         <w:p>

</xml_diff>